<commit_message>
docs: refresh articles for release demo path
</commit_message>
<xml_diff>
--- a/docs/articles/01-introduction-lumi-social-intelligence.docx
+++ b/docs/articles/01-introduction-lumi-social-intelligence.docx
@@ -130,7 +130,16 @@
         <w:t>Lumi Social Intelligence</w:t>
       </w:r>
       <w:r>
-        <w:t>. Development can happen in private workshops, but the public release surface should be clean, tested, documented, and safe to inspect. That release doorway exists to keep the public story coherent: three cooperating products working as one social-intelligence layer, rather than a scattered pile of internal experiments.</w:t>
+        <w:t xml:space="preserve">. In </w:t>
+      </w:r>
+      <w:r>
+        <w:rPr>
+          <w:rFonts w:ascii="Courier New" w:hAnsi="Courier New"/>
+        </w:rPr>
+        <w:t>v0.1.0</w:t>
+      </w:r>
+      <w:r>
+        <w:t>, that doorway has shipped as a private, review-gated Hermes preview: clean enough to inspect, packaged enough to verify, and intentionally conservative about live behavior. The release surface keeps the public story coherent: three cooperating products working as one social-intelligence layer, rather than a scattered pile of internal experiments.</w:t>
       </w:r>
     </w:p>
     <w:p>
@@ -224,7 +233,25 @@
     </w:p>
     <w:p>
       <w:r>
-        <w:t>The early release path is intentionally cautious. The repository is a private playground until release gates, public documentation, installer artifacts, and privacy scans are ready. Private development repositories can remain messy and experimental. The public doorway should only receive curated, tested, public-safe material. Raw runs, private memories, diaries, local runtime state, scheduler internals, credentials, chat IDs, private coordinates, and unverified host claims do not belong in the release surface.</w:t>
+        <w:t xml:space="preserve">The early release path is intentionally cautious. The repository has now crossed the first line: </w:t>
+      </w:r>
+      <w:r>
+        <w:rPr>
+          <w:rFonts w:ascii="Courier New" w:hAnsi="Courier New"/>
+        </w:rPr>
+        <w:t>v0.1.0</w:t>
+      </w:r>
+      <w:r>
+        <w:t xml:space="preserve"> is a private, reproducible, review-gated preview release with release artifacts, public-safe documentation, installer/adapter structure, and privacy scans. Private development repositories can remain messy and experimental. The public doorway only receives curated, tested, public-safe material. Raw runs, private memories, diaries, local runtime state, scheduler internals, credentials, chat IDs, private coordinates, and unverified host claims do not belong in the release surface. The next phase, </w:t>
+      </w:r>
+      <w:r>
+        <w:rPr>
+          <w:rFonts w:ascii="Courier New" w:hAnsi="Courier New"/>
+        </w:rPr>
+        <w:t>v0.2</w:t>
+      </w:r>
+      <w:r>
+        <w:t>, is integration and productization: prove live behavior, clean sprint-shaped public architecture, and produce one real demo flow with honest evidence.</w:t>
       </w:r>
     </w:p>
     <w:p>

</xml_diff>

<commit_message>
Update articles for current Live Surface status
</commit_message>
<xml_diff>
--- a/docs/articles/01-introduction-lumi-social-intelligence.docx
+++ b/docs/articles/01-introduction-lumi-social-intelligence.docx
@@ -121,7 +121,7 @@
     </w:p>
     <w:p>
       <w:r>
-        <w:t xml:space="preserve">The first release doorway is </w:t>
+        <w:t xml:space="preserve">The release doorway is </w:t>
       </w:r>
       <w:r>
         <w:rPr>
@@ -130,16 +130,7 @@
         <w:t>Lumi Social Intelligence</w:t>
       </w:r>
       <w:r>
-        <w:t xml:space="preserve">. In </w:t>
-      </w:r>
-      <w:r>
-        <w:rPr>
-          <w:rFonts w:ascii="Courier New" w:hAnsi="Courier New"/>
-        </w:rPr>
-        <w:t>v0.1.0</w:t>
-      </w:r>
-      <w:r>
-        <w:t>, that doorway has shipped as a private, review-gated Hermes preview: clean enough to inspect, packaged enough to verify, and intentionally conservative about live behavior. The release surface keeps the public story coherent: three cooperating products working as one social-intelligence layer, rather than a scattered pile of internal experiments.</w:t>
+        <w:t>. It has moved beyond a packaging-only preview into a public-safe release surface with tested modules, release artifacts, documentation, and a conservative Live Surface path for natural-language controls. The release surface keeps the public story coherent: three cooperating products working as one social-intelligence layer, rather than a scattered pile of internal experiments.</w:t>
       </w:r>
     </w:p>
     <w:p>
@@ -233,25 +224,7 @@
     </w:p>
     <w:p>
       <w:r>
-        <w:t xml:space="preserve">The early release path is intentionally cautious. The repository has now crossed the first line: </w:t>
-      </w:r>
-      <w:r>
-        <w:rPr>
-          <w:rFonts w:ascii="Courier New" w:hAnsi="Courier New"/>
-        </w:rPr>
-        <w:t>v0.1.0</w:t>
-      </w:r>
-      <w:r>
-        <w:t xml:space="preserve"> is a private, reproducible, review-gated preview release with release artifacts, public-safe documentation, installer/adapter structure, and privacy scans. Private development repositories can remain messy and experimental. The public doorway only receives curated, tested, public-safe material. Raw runs, private memories, diaries, local runtime state, scheduler internals, credentials, chat IDs, private coordinates, and unverified host claims do not belong in the release surface. The next phase, </w:t>
-      </w:r>
-      <w:r>
-        <w:rPr>
-          <w:rFonts w:ascii="Courier New" w:hAnsi="Courier New"/>
-        </w:rPr>
-        <w:t>v0.2</w:t>
-      </w:r>
-      <w:r>
-        <w:t>, is integration and productization: prove live behavior, clean sprint-shaped public architecture, and produce one real demo flow with honest evidence.</w:t>
+        <w:t>The release path remains intentionally cautious. The repository has crossed from preview packaging into a tested public doorway: release artifacts, public-safe documentation, installer/adapter structure, privacy scans, Live Surface contracts, and natural-language controls that treat user phrasing as semantic intent rather than brittle keywords. Private development repositories can remain messy and experimental. The public doorway only receives curated, tested, public-safe material. Raw runs, private memories, diaries, local runtime state, scheduler internals, credentials, chat IDs, private coordinates, and unverified host claims do not belong in the release surface. The next phase is integration and productization: connect more host behavior to the same review-gated contracts, expand honest demo evidence, and keep live-host limitations documented clearly.</w:t>
       </w:r>
     </w:p>
     <w:p>

</xml_diff>